<commit_message>
Modulo de simulacion completo endt-to-end
</commit_message>
<xml_diff>
--- a/docs/Manual_Usuario_USIL.docx
+++ b/docs/Manual_Usuario_USIL.docx
@@ -456,11 +456,9 @@
           <w:b/>
           <w:bCs/>
         </w:rPr>
-        <w:t xml:space="preserve">Coordinador Académico: </w:t>
-      </w:r>
-      <w:r>
-        <w:t xml:space="preserve">gestiona mallas, equivalencias, simulaciones y convalidaciones de las carreras que tiene asignadas.</w:t>
-      </w:r>
+        <w:t>Superusuario: administración total: usuarios, configuración, estructura institucional y todos los módulos.</w:t>
+      </w:r>
+      <w:r/>
     </w:p>
     <w:p>
       <w:pPr>
@@ -476,11 +474,99 @@
           <w:b/>
           <w:bCs/>
         </w:rPr>
-        <w:t xml:space="preserve">Administrador: </w:t>
-      </w:r>
-      <w:r>
-        <w:t xml:space="preserve">gestiona usuarios y permisos, y consulta reportes globales.</w:t>
-      </w:r>
+        <w:t>Servicios Académicos (Admisión): registra postulantes/solicitudes, las asigna a un coordinador y consulta reportes. No accede a simulaciones ni equivalencias.</w:t>
+      </w:r>
+      <w:r/>
+    </w:p>
+    <w:p>
+      <w:pPr>
+        <w:pStyle w:val="ListParagraph"/>
+        <w:numPr>
+          <w:ilvl w:val="0"/>
+          <w:numId w:val="2"/>
+        </w:numPr>
+        <w:spacing w:after="70"/>
+      </w:pPr>
+      <w:r>
+        <w:rPr>
+          <w:b/>
+          <w:bCs/>
+        </w:rPr>
+        <w:t>Coordinador de Carrera: gestiona mallas, equivalencias y simulaciones (preconvalidación) de las carreras que tiene asignadas.</w:t>
+      </w:r>
+      <w:r/>
+    </w:p>
+    <w:p>
+      <w:pPr>
+        <w:pStyle w:val="ListParagraph"/>
+        <w:numPr>
+          <w:ilvl w:val="0"/>
+          <w:numId w:val="2"/>
+        </w:numPr>
+        <w:spacing w:after="70"/>
+      </w:pPr>
+      <w:r>
+        <w:rPr>
+          <w:b/>
+          <w:bCs/>
+        </w:rPr>
+        <w:t>Director de Escuela: todo lo del Coordinador y además aprueba, observa/devuelve y reasigna evaluaciones de sus carreras.</w:t>
+      </w:r>
+      <w:r/>
+    </w:p>
+    <w:p>
+      <w:pPr>
+        <w:pStyle w:val="ListParagraph"/>
+        <w:numPr>
+          <w:ilvl w:val="0"/>
+          <w:numId w:val="2"/>
+        </w:numPr>
+        <w:spacing w:after="70"/>
+      </w:pPr>
+      <w:r>
+        <w:rPr>
+          <w:b/>
+          <w:bCs/>
+        </w:rPr>
+        <w:t>Decano: gestiona y aprueba equivalencias de su facultad, y confirma o anula la convalidación definitiva con su memorándum.</w:t>
+      </w:r>
+      <w:r/>
+    </w:p>
+    <w:p>
+      <w:pPr>
+        <w:pStyle w:val="ListParagraph"/>
+        <w:numPr>
+          <w:ilvl w:val="0"/>
+          <w:numId w:val="2"/>
+        </w:numPr>
+        <w:spacing w:after="70"/>
+      </w:pPr>
+      <w:r>
+        <w:rPr>
+          <w:b/>
+          <w:bCs/>
+        </w:rPr>
+        <w:t>Auditor: solo lectura: consulta solicitudes, evaluaciones, convalidaciones, reportes y el registro de auditoría.</w:t>
+      </w:r>
+      <w:r/>
+    </w:p>
+    <w:p>
+      <w:pPr>
+        <w:pStyle w:val="ListParagraph"/>
+        <w:numPr>
+          <w:ilvl w:val="0"/>
+          <w:numId w:val="2"/>
+        </w:numPr>
+        <w:spacing w:after="70"/>
+      </w:pPr>
+      <w:r>
+        <w:rPr>
+          <w:b/>
+          <w:bCs/>
+        </w:rPr>
+        <w:t>Consulta / Alta Dirección: perfil ejecutivo de solo lectura sobre el panel y los reportes.</w:t>
+      </w:r>
+      <w:r/>
     </w:p>
     <w:p>
       <w:pPr>

</xml_diff>